<commit_message>
docs: completa las evidencias individuales de Edgar con sus datos
Los tres documentos estaban en el repositorio como borrador, con cinco
marcadores en amarillo esperando datos que solo tiene el autor. Ya no
queda ninguno: año de ingreso 2021, las asignaturas que más marcaron su
formación, la proyección profesional a cinco años y el momento en que
diseñó las tres propuestas.

Los niveles de logro del 1.1 y del 1.3 siguen siendo los del borrador y
están pendientes de que Edgar los confirme.

Co-Authored-By: Claude Opus 5 (1M context) <noreply@anthropic.com>
Claude-Session: https://claude.ai/code/session_01Rvh88dkfXqgVzQiFw1YokL
</commit_message>
<xml_diff>
--- a/Fase 1/Evidencias Individuales/Tolentino_Edgar_1.1_APT122_AutoevaluacionCompetenciasFase1.docx
+++ b/Fase 1/Evidencias Individuales/Tolentino_Edgar_1.1_APT122_AutoevaluacionCompetenciasFase1.docx
@@ -1055,9 +1055,8 @@
                 <w:rFonts w:ascii="Calibri" w:hAnsi="Calibri" w:eastAsia="Calibri"/>
                 <w:color w:val="1C1C1C"/>
                 <w:sz w:val="22"/>
-                <w:highlight w:val="yellow"/>
-              </w:rPr>
-              <w:t>[[Año de ingreso]]</w:t>
+              </w:rPr>
+              <w:t>2021</w:t>
             </w:r>
           </w:p>
         </w:tc>

</xml_diff>